<commit_message>
7-partiya: 61–70-mavzular; 041, 054 emlash kalendari bo'yicha yangilandi
</commit_message>
<xml_diff>
--- a/Мавзу2/041.docx
+++ b/Мавзу2/041.docx
@@ -395,7 +395,7 @@
           <w:b w:val="0"/>
           <w:sz w:val="28"/>
         </w:rPr>
-        <w:t>Vaksinalar va anatoksinlar aktiv, immun zardoblar va immunoglobulinlar passiv immunizatsiya uchun ishlatiladi [1]. O'zbekistonda yuqumli kasalliklarning immunoprofilaktikasi 2003-yil 1-yanvardan kuchga kirgan sanitariya qoida va me'yorlariga asosan olib boriladi; emlash majburiy va epidemiologik ko'rsatmaga ko'ra o'tkaziladi [1]. Kalendar bo'yicha hayotning birinchi kunida gepatit B vaksinasi, 2–5-kunlarda BSJ va OPV-0, keyingi oylarda AKDS, OPV va boshqa emlashlar beriladi [1]. Epidemiologik ko'rsatma bo'yicha emlash enzootik hududlarda, o'ta xavfli infeksiyalar bilan ishlaydigan laboratoriya xodimlarida, kasbiy xavfi bor ishchilarda va xorijga chiquvchilarda o'tkaziladi [1].</w:t>
+        <w:t>Vaksinalar va anatoksinlar aktiv, immun zardoblar va immunoglobulinlar passiv immunizatsiya uchun ishlatiladi [1]. O'zbekistonda yuqumli kasalliklarning immunoprofilaktikasi sanitariya qoida va me'yorlariga (SanQvaN № 0239-07) asosan olib boriladi; emlash profilaktik kalendar bo'yicha va epidemiologik ko'rsatmaga ko'ra o'tkaziladi [1][2]. Kalendarda hayotning birinchi sutkasida gepatit B vaksinasi, 2–5-kunlarda BSJ, 2, 3 va 4 oylikda OPV, pentavalent (AKDS + gepatit B + XIB) va rotavirus vaksinalari, 2, 3 va 12 oylikda pnevmokokk vaksinasi, 12 oylikda va 6 yoshda QPQ ko'zda tutilgan [2][3]. Aliyev va Muxamedovning 2013-yilgi qo'llanmasidagi eski jadvalda penta-, rota- va pnevmokokk vaksinalari yo'q edi [1]. Epidemiologik ko'rsatma bo'yicha emlash enzootik hududlarda, o'ta xavfli infeksiyalar bilan ishlaydigan laboratoriya xodimlarida, kasbiy xavfi bor ishchilarda va xorijga chiquvchilarda o'tkaziladi [1].</w:t>
       </w:r>
     </w:p>
     <w:p>
@@ -494,6 +494,34 @@
           <w:sz w:val="24"/>
         </w:rPr>
         <w:t>[1] Aliyev ShR, Muxamedov IM. Mikrobiologiyadan laboratoriya mashg'ulotlariga doir qo'llanma. Toshkent: Ibn Sino nomidagi nashriyot-matbaa birlashmasi; 2013 (kirill yozuvida). Xayrullo Komilov kutubxonasi, id 2355: https://xayrullokomilov.uz/kutubxona/2355</w:t>
+      </w:r>
+    </w:p>
+    <w:p>
+      <w:pPr>
+        <w:spacing w:line="276" w:lineRule="auto"/>
+        <w:jc w:val="left"/>
+      </w:pPr>
+      <w:r>
+        <w:rPr>
+          <w:rFonts w:ascii="Times New Roman" w:hAnsi="Times New Roman" w:eastAsia="Times New Roman"/>
+          <w:b w:val="0"/>
+          <w:sz w:val="24"/>
+        </w:rPr>
+        <w:t>[2] SanQvaN (SanPiN) № 0239-07. O'zbekiston Respublikasida yuqumli kasalliklar immunoprofilaktikasi (3-son, 25.07.2017; lex.uz/docs/5524039) (kirill yozuvida). Xayrullo Komilov kutubxonasi, id 814: https://xayrullokomilov.uz/kutubxona/814</w:t>
+      </w:r>
+    </w:p>
+    <w:p>
+      <w:pPr>
+        <w:spacing w:line="276" w:lineRule="auto"/>
+        <w:jc w:val="left"/>
+      </w:pPr>
+      <w:r>
+        <w:rPr>
+          <w:rFonts w:ascii="Times New Roman" w:hAnsi="Times New Roman" w:eastAsia="Times New Roman"/>
+          <w:b w:val="0"/>
+          <w:sz w:val="24"/>
+        </w:rPr>
+        <w:t>[3] O'zbekiston Respublikasida profilaktik emlashlar o'tkazish kalendar rejasi («Emlash kalendari», sanasi ko'rsatilmagan; uch tilda). Xayrullo Komilov kutubxonasi, id 1420: https://xayrullokomilov.uz/kutubxona/1420</w:t>
       </w:r>
     </w:p>
     <w:sectPr>

</xml_diff>